<commit_message>
ds: scrub em/en dashes from report copy, re-render PDF and DOCX
Replace every em dash and en dash in outputs/report.md and
submission_v2/report_full.md with commas, semicolons, or short
new sentences. Add a TL;DR Headline numbers block at the top of
report_full.md mirroring the README, add a note explaining why
Extreme Greed is absent from the per-regime AUC table (under 50
close events in test window), and add the n_jobs=1 caveat.
Re-render report.pdf and report.docx via pandoc.
</commit_message>
<xml_diff>
--- a/DS/submission_v2/report.docx
+++ b/DS/submission_v2/report.docx
@@ -26,13 +26,110 @@
         <w:t xml:space="preserve">Kartik Shirode</w:t>
       </w:r>
     </w:p>
-    <w:bookmarkStart w:id="37" w:name="X64c9cec8d4209c436c158084507b60911520bc3"/>
+    <w:bookmarkStart w:id="38" w:name="X64c9cec8d4209c436c158084507b60911520bc3"/>
     <w:p>
       <w:pPr>
         <w:pStyle w:val="Heading1"/>
       </w:pPr>
       <w:r>
         <w:t xml:space="preserve">Trader Performance vs Bitcoin Sentiment (v2)</w:t>
+      </w:r>
+    </w:p>
+    <w:bookmarkStart w:id="12" w:name="headline-numbers"/>
+    <w:p>
+      <w:pPr>
+        <w:pStyle w:val="Heading2"/>
+      </w:pPr>
+      <w:r>
+        <w:t xml:space="preserve">Headline numbers</w:t>
+      </w:r>
+    </w:p>
+    <w:p>
+      <w:pPr>
+        <w:pStyle w:val="Compact"/>
+        <w:numPr>
+          <w:ilvl w:val="0"/>
+          <w:numId w:val="1001"/>
+        </w:numPr>
+      </w:pPr>
+      <w:r>
+        <w:rPr>
+          <w:b/>
+          <w:bCs/>
+        </w:rPr>
+        <w:t xml:space="preserve">Extreme Greed regime</w:t>
+      </w:r>
+      <w:r>
+        <w:t xml:space="preserve"> </w:t>
+      </w:r>
+      <w:r>
+        <w:t xml:space="preserve">posts the highest profitability across every metric (win rate 89.2 %, profit factor 11.0, ROI 2.18 %).</w:t>
+      </w:r>
+    </w:p>
+    <w:p>
+      <w:pPr>
+        <w:pStyle w:val="Compact"/>
+        <w:numPr>
+          <w:ilvl w:val="0"/>
+          <w:numId w:val="1001"/>
+        </w:numPr>
+      </w:pPr>
+      <w:r>
+        <w:rPr>
+          <w:b/>
+          <w:bCs/>
+        </w:rPr>
+        <w:t xml:space="preserve">Plain Greed regime</w:t>
+      </w:r>
+      <w:r>
+        <w:t xml:space="preserve"> </w:t>
+      </w:r>
+      <w:r>
+        <w:t xml:space="preserve">is the worst by Sharpe (3.41) and drawdown ($-419k).</w:t>
+      </w:r>
+    </w:p>
+    <w:p>
+      <w:pPr>
+        <w:pStyle w:val="Compact"/>
+        <w:numPr>
+          <w:ilvl w:val="0"/>
+          <w:numId w:val="1001"/>
+        </w:numPr>
+      </w:pPr>
+      <w:r>
+        <w:rPr>
+          <w:b/>
+          <w:bCs/>
+        </w:rPr>
+        <w:t xml:space="preserve">Win-probability model</w:t>
+      </w:r>
+      <w:r>
+        <w:t xml:space="preserve"> </w:t>
+      </w:r>
+      <w:r>
+        <w:t xml:space="preserve">clears AUC 0.81 in Extreme Fear, AUC 0.49 in plain Fear; the model is most useful as an extreme-zone filter.</w:t>
+      </w:r>
+    </w:p>
+    <w:p>
+      <w:pPr>
+        <w:pStyle w:val="Compact"/>
+        <w:numPr>
+          <w:ilvl w:val="0"/>
+          <w:numId w:val="1001"/>
+        </w:numPr>
+      </w:pPr>
+      <w:r>
+        <w:rPr>
+          <w:b/>
+          <w:bCs/>
+        </w:rPr>
+        <w:t xml:space="preserve">Strategy backtest</w:t>
+      </w:r>
+      <w:r>
+        <w:t xml:space="preserve"> </w:t>
+      </w:r>
+      <w:r>
+        <w:t xml:space="preserve">(regime filter + win-prob filter) ships +13.5 % more PnL on half the trades, Sharpe 14.6 vs 6.6 baseline, zero drawdown.</w:t>
       </w:r>
     </w:p>
     <w:p>
@@ -98,7 +195,8 @@
         <w:t xml:space="preserve">Bitcoin Fear and Greed Index over time</w:t>
       </w:r>
     </w:p>
-    <w:bookmarkStart w:id="12" w:name="what-the-data-looks-like"/>
+    <w:bookmarkEnd w:id="12"/>
+    <w:bookmarkStart w:id="13" w:name="what-the-data-looks-like"/>
     <w:p>
       <w:pPr>
         <w:pStyle w:val="Heading2"/>
@@ -151,8 +249,8 @@
         <w:t xml:space="preserve">2,644 daily rows from 2018-02-01 to 2025-05-02, five-class label (Extreme Fear, Fear, Neutral, Greed, Extreme Greed) and a numeric 0 to 100 value. The trades window sits entirely inside the sentiment window, so the join is clean: 6 unlabelled trades out of 211k.</w:t>
       </w:r>
     </w:p>
-    <w:bookmarkEnd w:id="12"/>
-    <w:bookmarkStart w:id="16" w:name="X8b44196c359d3b3ba94e96acf5c51a29744dcad"/>
+    <w:bookmarkEnd w:id="13"/>
+    <w:bookmarkStart w:id="17" w:name="X8b44196c359d3b3ba94e96acf5c51a29744dcad"/>
     <w:p>
       <w:pPr>
         <w:pStyle w:val="Heading2"/>
@@ -712,18 +810,18 @@
           <wp:inline>
             <wp:extent cx="5334000" cy="3000375"/>
             <wp:effectExtent b="0" l="0" r="0" t="0"/>
-            <wp:docPr descr="Headline metrics by regime" title="" id="14" name="Picture"/>
+            <wp:docPr descr="Headline metrics by regime" title="" id="15" name="Picture"/>
             <a:graphic>
               <a:graphicData uri="http://schemas.openxmlformats.org/drawingml/2006/picture">
                 <pic:pic>
                   <pic:nvPicPr>
-                    <pic:cNvPr descr="metrics_by_regime.png" id="15" name="Picture"/>
+                    <pic:cNvPr descr="metrics_by_regime.png" id="16" name="Picture"/>
                     <pic:cNvPicPr>
                       <a:picLocks noChangeArrowheads="1" noChangeAspect="1"/>
                     </pic:cNvPicPr>
                   </pic:nvPicPr>
                   <pic:blipFill>
-                    <a:blip r:embed="rId13"/>
+                    <a:blip r:embed="rId14"/>
                     <a:stretch>
                       <a:fillRect/>
                     </a:stretch>
@@ -758,8 +856,8 @@
         <w:t xml:space="preserve">Headline metrics by regime</w:t>
       </w:r>
     </w:p>
-    <w:bookmarkEnd w:id="16"/>
-    <w:bookmarkStart w:id="20" w:name="regime-level-metric-table"/>
+    <w:bookmarkEnd w:id="17"/>
+    <w:bookmarkStart w:id="21" w:name="regime-level-metric-table"/>
     <w:p>
       <w:pPr>
         <w:pStyle w:val="Heading2"/>
@@ -1358,18 +1456,18 @@
           <wp:inline>
             <wp:extent cx="5334000" cy="1905000"/>
             <wp:effectExtent b="0" l="0" r="0" t="0"/>
-            <wp:docPr descr="Cumulative PnL by regime" title="" id="18" name="Picture"/>
+            <wp:docPr descr="Cumulative PnL by regime" title="" id="19" name="Picture"/>
             <a:graphic>
               <a:graphicData uri="http://schemas.openxmlformats.org/drawingml/2006/picture">
                 <pic:pic>
                   <pic:nvPicPr>
-                    <pic:cNvPr descr="cumulative_pnl_by_regime.png" id="19" name="Picture"/>
+                    <pic:cNvPr descr="cumulative_pnl_by_regime.png" id="20" name="Picture"/>
                     <pic:cNvPicPr>
                       <a:picLocks noChangeArrowheads="1" noChangeAspect="1"/>
                     </pic:cNvPicPr>
                   </pic:nvPicPr>
                   <pic:blipFill>
-                    <a:blip r:embed="rId17"/>
+                    <a:blip r:embed="rId18"/>
                     <a:stretch>
                       <a:fillRect/>
                     </a:stretch>
@@ -1404,8 +1502,8 @@
         <w:t xml:space="preserve">Cumulative PnL by regime</w:t>
       </w:r>
     </w:p>
-    <w:bookmarkEnd w:id="20"/>
-    <w:bookmarkStart w:id="21" w:name="new-trader-cohorts-kmeans-clustering"/>
+    <w:bookmarkEnd w:id="21"/>
+    <w:bookmarkStart w:id="22" w:name="new-trader-cohorts-kmeans-clustering"/>
     <w:p>
       <w:pPr>
         <w:pStyle w:val="Heading2"/>
@@ -2429,8 +2527,8 @@
         <w:t xml:space="preserve">.</w:t>
       </w:r>
     </w:p>
-    <w:bookmarkEnd w:id="21"/>
-    <w:bookmarkStart w:id="28" w:name="X08b9f17fcd00771ac1844d5c666b596e08fd527"/>
+    <w:bookmarkEnd w:id="22"/>
+    <w:bookmarkStart w:id="29" w:name="X08b9f17fcd00771ac1844d5c666b596e08fd527"/>
     <w:p>
       <w:pPr>
         <w:pStyle w:val="Heading2"/>
@@ -2713,7 +2811,42 @@
         <w:pStyle w:val="BodyText"/>
       </w:pPr>
       <w:r>
-        <w:t xml:space="preserve">The model has clear predictive power on Extreme Fear days (AUC 0.81) and useful signal on Greed days (0.62). On plain Fear days the AUC sits at chance (0.49) — those trades look essentially random given the features. That asymmetry is the actionable result: the model is most useful as a filter when the index is in the extreme zones, not the middle.</w:t>
+        <w:t xml:space="preserve">The model has clear predictive power on Extreme Fear days (AUC 0.81) and useful signal on Greed days (0.62). On plain Fear days the AUC sits at chance (0.49); those trades look essentially random given the features. That asymmetry is the actionable result: the model is most useful as a filter when the index is in the extreme zones, not the middle.</w:t>
+      </w:r>
+    </w:p>
+    <w:p>
+      <w:pPr>
+        <w:pStyle w:val="BodyText"/>
+      </w:pPr>
+      <w:r>
+        <w:t xml:space="preserve">Extreme Greed is missing from the per-regime AUC table because the regime had under 50 close events in the held-out test window, so the per-slice AUC was suppressed to avoid a noisy estimate (see the</w:t>
+      </w:r>
+      <w:r>
+        <w:t xml:space="preserve"> </w:t>
+      </w:r>
+      <w:r>
+        <w:rPr>
+          <w:rStyle w:val="VerbatimChar"/>
+        </w:rPr>
+        <w:t xml:space="preserve">mask.sum() &lt; 50</w:t>
+      </w:r>
+      <w:r>
+        <w:t xml:space="preserve"> </w:t>
+      </w:r>
+      <w:r>
+        <w:t xml:space="preserve">guard in</w:t>
+      </w:r>
+      <w:r>
+        <w:t xml:space="preserve"> </w:t>
+      </w:r>
+      <w:r>
+        <w:rPr>
+          <w:rStyle w:val="VerbatimChar"/>
+        </w:rPr>
+        <w:t xml:space="preserve">evaluate_winprob</w:t>
+      </w:r>
+      <w:r>
+        <w:t xml:space="preserve">).</w:t>
       </w:r>
     </w:p>
     <w:p>
@@ -2772,18 +2905,18 @@
           <wp:inline>
             <wp:extent cx="5334000" cy="4572000"/>
             <wp:effectExtent b="0" l="0" r="0" t="0"/>
-            <wp:docPr descr="Win-probability calibration on the test slice" title="" id="23" name="Picture"/>
+            <wp:docPr descr="Win-probability calibration on the test slice" title="" id="24" name="Picture"/>
             <a:graphic>
               <a:graphicData uri="http://schemas.openxmlformats.org/drawingml/2006/picture">
                 <pic:pic>
                   <pic:nvPicPr>
-                    <pic:cNvPr descr="winprob_calibration.png" id="24" name="Picture"/>
+                    <pic:cNvPr descr="winprob_calibration.png" id="25" name="Picture"/>
                     <pic:cNvPicPr>
                       <a:picLocks noChangeArrowheads="1" noChangeAspect="1"/>
                     </pic:cNvPicPr>
                   </pic:nvPicPr>
                   <pic:blipFill>
-                    <a:blip r:embed="rId22"/>
+                    <a:blip r:embed="rId23"/>
                     <a:stretch>
                       <a:fillRect/>
                     </a:stretch>
@@ -2827,18 +2960,18 @@
           <wp:inline>
             <wp:extent cx="5334000" cy="2667000"/>
             <wp:effectExtent b="0" l="0" r="0" t="0"/>
-            <wp:docPr descr="Top 10 feature importances" title="" id="26" name="Picture"/>
+            <wp:docPr descr="Top 10 feature importances" title="" id="27" name="Picture"/>
             <a:graphic>
               <a:graphicData uri="http://schemas.openxmlformats.org/drawingml/2006/picture">
                 <pic:pic>
                   <pic:nvPicPr>
-                    <pic:cNvPr descr="winprob_feature_importance.png" id="27" name="Picture"/>
+                    <pic:cNvPr descr="winprob_feature_importance.png" id="28" name="Picture"/>
                     <pic:cNvPicPr>
                       <a:picLocks noChangeArrowheads="1" noChangeAspect="1"/>
                     </pic:cNvPicPr>
                   </pic:nvPicPr>
                   <pic:blipFill>
-                    <a:blip r:embed="rId25"/>
+                    <a:blip r:embed="rId26"/>
                     <a:stretch>
                       <a:fillRect/>
                     </a:stretch>
@@ -2873,8 +3006,8 @@
         <w:t xml:space="preserve">Top 10 feature importances</w:t>
       </w:r>
     </w:p>
-    <w:bookmarkEnd w:id="28"/>
-    <w:bookmarkStart w:id="32" w:name="new-walk-forward-backtest"/>
+    <w:bookmarkEnd w:id="29"/>
+    <w:bookmarkStart w:id="33" w:name="new-walk-forward-backtest"/>
     <w:p>
       <w:pPr>
         <w:pStyle w:val="Heading2"/>
@@ -3182,7 +3315,7 @@
         <w:t xml:space="preserve"> </w:t>
       </w:r>
       <w:r>
-        <w:t xml:space="preserve">alone (without the Greed exclusion) shows the threshold by itself does not produce uplift — the regime filter is the load-bearing piece.</w:t>
+        <w:t xml:space="preserve">alone (without the Greed exclusion) shows the threshold by itself does not produce uplift; the regime filter is the load-bearing piece.</w:t>
       </w:r>
     </w:p>
     <w:tbl>
@@ -3510,18 +3643,18 @@
           <wp:inline>
             <wp:extent cx="5334000" cy="1905000"/>
             <wp:effectExtent b="0" l="0" r="0" t="0"/>
-            <wp:docPr descr="Backtest equity curves" title="" id="30" name="Picture"/>
+            <wp:docPr descr="Backtest equity curves" title="" id="31" name="Picture"/>
             <a:graphic>
               <a:graphicData uri="http://schemas.openxmlformats.org/drawingml/2006/picture">
                 <pic:pic>
                   <pic:nvPicPr>
-                    <pic:cNvPr descr="backtest_equity.png" id="31" name="Picture"/>
+                    <pic:cNvPr descr="backtest_equity.png" id="32" name="Picture"/>
                     <pic:cNvPicPr>
                       <a:picLocks noChangeArrowheads="1" noChangeAspect="1"/>
                     </pic:cNvPicPr>
                   </pic:nvPicPr>
                   <pic:blipFill>
-                    <a:blip r:embed="rId29"/>
+                    <a:blip r:embed="rId30"/>
                     <a:stretch>
                       <a:fillRect/>
                     </a:stretch>
@@ -3556,8 +3689,8 @@
         <w:t xml:space="preserve">Backtest equity curves</w:t>
       </w:r>
     </w:p>
-    <w:bookmarkEnd w:id="32"/>
-    <w:bookmarkStart w:id="33" w:name="streamlit-dashboard"/>
+    <w:bookmarkEnd w:id="33"/>
+    <w:bookmarkStart w:id="34" w:name="streamlit-dashboard"/>
     <w:p>
       <w:pPr>
         <w:pStyle w:val="Heading2"/>
@@ -3618,7 +3751,7 @@
         <w:pStyle w:val="Compact"/>
         <w:numPr>
           <w:ilvl w:val="0"/>
-          <w:numId w:val="1001"/>
+          <w:numId w:val="1002"/>
         </w:numPr>
       </w:pPr>
       <w:r>
@@ -3629,10 +3762,7 @@
         <w:t xml:space="preserve">Overview</w:t>
       </w:r>
       <w:r>
-        <w:t xml:space="preserve"> </w:t>
-      </w:r>
-      <w:r>
-        <w:t xml:space="preserve">— date-range filter, regime distribution, headline metrics by regime, cumulative PnL by regime.</w:t>
+        <w:t xml:space="preserve">, date-range filter, regime distribution, headline metrics by regime, cumulative PnL by regime.</w:t>
       </w:r>
     </w:p>
     <w:p>
@@ -3640,7 +3770,7 @@
         <w:pStyle w:val="Compact"/>
         <w:numPr>
           <w:ilvl w:val="0"/>
-          <w:numId w:val="1001"/>
+          <w:numId w:val="1002"/>
         </w:numPr>
       </w:pPr>
       <w:r>
@@ -3651,10 +3781,7 @@
         <w:t xml:space="preserve">Trader Explorer</w:t>
       </w:r>
       <w:r>
-        <w:t xml:space="preserve"> </w:t>
-      </w:r>
-      <w:r>
-        <w:t xml:space="preserve">— searchable account dropdown. Shows that trader’s per-regime metrics, their cohort badge, per-coin PnL, and the model’s predicted vs realised win rate on their close events.</w:t>
+        <w:t xml:space="preserve">, searchable account dropdown. Shows that trader’s per-regime metrics, their cohort badge, per-coin PnL, and the model’s predicted vs realised win rate on their close events.</w:t>
       </w:r>
     </w:p>
     <w:p>
@@ -3662,7 +3789,7 @@
         <w:pStyle w:val="Compact"/>
         <w:numPr>
           <w:ilvl w:val="0"/>
-          <w:numId w:val="1001"/>
+          <w:numId w:val="1002"/>
         </w:numPr>
       </w:pPr>
       <w:r>
@@ -3673,10 +3800,7 @@
         <w:t xml:space="preserve">Strategy Simulator</w:t>
       </w:r>
       <w:r>
-        <w:t xml:space="preserve"> </w:t>
-      </w:r>
-      <w:r>
-        <w:t xml:space="preserve">— sliders for</w:t>
+        <w:t xml:space="preserve">, sliders for</w:t>
       </w:r>
       <w:r>
         <w:t xml:space="preserve"> </w:t>
@@ -3691,96 +3815,14 @@
         <w:t xml:space="preserve">, regime exclusions, and cohort filters. Outputs the live backtest table (taken trades, PnL, Sharpe, max DD vs baseline) and the equity curve.</w:t>
       </w:r>
     </w:p>
-    <w:bookmarkEnd w:id="33"/>
-    <w:bookmarkStart w:id="34" w:name="caveats"/>
+    <w:bookmarkEnd w:id="34"/>
+    <w:bookmarkStart w:id="35" w:name="caveats"/>
     <w:p>
       <w:pPr>
         <w:pStyle w:val="Heading2"/>
       </w:pPr>
       <w:r>
         <w:t xml:space="preserve">8. Caveats</w:t>
-      </w:r>
-    </w:p>
-    <w:p>
-      <w:pPr>
-        <w:pStyle w:val="Compact"/>
-        <w:numPr>
-          <w:ilvl w:val="0"/>
-          <w:numId w:val="1002"/>
-        </w:numPr>
-      </w:pPr>
-      <w:r>
-        <w:t xml:space="preserve">The trades window is two years and entirely post-2023. Conclusions speak to the late-2023 to early-2025 cycle, not earlier eras.</w:t>
-      </w:r>
-    </w:p>
-    <w:p>
-      <w:pPr>
-        <w:pStyle w:val="Compact"/>
-        <w:numPr>
-          <w:ilvl w:val="0"/>
-          <w:numId w:val="1002"/>
-        </w:numPr>
-      </w:pPr>
-      <w:r>
-        <w:t xml:space="preserve">Closed PnL only shows on close events. Open positions are not marked to market. Sharpe and drawdown reflect realised PnL only.</w:t>
-      </w:r>
-    </w:p>
-    <w:p>
-      <w:pPr>
-        <w:pStyle w:val="Compact"/>
-        <w:numPr>
-          <w:ilvl w:val="0"/>
-          <w:numId w:val="1002"/>
-        </w:numPr>
-      </w:pPr>
-      <w:r>
-        <w:t xml:space="preserve">No leverage column, so position risk is approximated by notional and per-trade stdev.</w:t>
-      </w:r>
-    </w:p>
-    <w:p>
-      <w:pPr>
-        <w:pStyle w:val="Compact"/>
-        <w:numPr>
-          <w:ilvl w:val="0"/>
-          <w:numId w:val="1002"/>
-        </w:numPr>
-      </w:pPr>
-      <w:r>
-        <w:t xml:space="preserve">32 active traders is a small cohort sample. The headline regime numbers use the full 211k trades so those are sturdier than the cohort characterisations.</w:t>
-      </w:r>
-    </w:p>
-    <w:p>
-      <w:pPr>
-        <w:pStyle w:val="Compact"/>
-        <w:numPr>
-          <w:ilvl w:val="0"/>
-          <w:numId w:val="1002"/>
-        </w:numPr>
-      </w:pPr>
-      <w:r>
-        <w:t xml:space="preserve">The Sharpe number uses sqrt(365) annualisation, standard for 24/7 crypto markets but inflated vs the 252-day equity convention.</w:t>
-      </w:r>
-    </w:p>
-    <w:p>
-      <w:pPr>
-        <w:pStyle w:val="Compact"/>
-        <w:numPr>
-          <w:ilvl w:val="0"/>
-          <w:numId w:val="1002"/>
-        </w:numPr>
-      </w:pPr>
-      <w:r>
-        <w:t xml:space="preserve">The win-prob model uses a time-based split (first 80% train, last 20% test). Any per-trader feature is computed on earlier trades only, so there is no leakage by construction.</w:t>
-      </w:r>
-    </w:p>
-    <w:bookmarkEnd w:id="34"/>
-    <w:bookmarkStart w:id="35" w:name="strategy-ideas-worth-a-follow-up"/>
-    <w:p>
-      <w:pPr>
-        <w:pStyle w:val="Heading2"/>
-      </w:pPr>
-      <w:r>
-        <w:t xml:space="preserve">9. Strategy ideas worth a follow-up</w:t>
       </w:r>
     </w:p>
     <w:p>
@@ -3792,6 +3834,100 @@
         </w:numPr>
       </w:pPr>
       <w:r>
+        <w:t xml:space="preserve">The trades window is two years and entirely post-2023. Conclusions speak to the late-2023 to early-2025 cycle, not earlier eras.</w:t>
+      </w:r>
+    </w:p>
+    <w:p>
+      <w:pPr>
+        <w:pStyle w:val="Compact"/>
+        <w:numPr>
+          <w:ilvl w:val="0"/>
+          <w:numId w:val="1003"/>
+        </w:numPr>
+      </w:pPr>
+      <w:r>
+        <w:t xml:space="preserve">Closed PnL only shows on close events. Open positions are not marked to market. Sharpe and drawdown reflect realised PnL only.</w:t>
+      </w:r>
+    </w:p>
+    <w:p>
+      <w:pPr>
+        <w:pStyle w:val="Compact"/>
+        <w:numPr>
+          <w:ilvl w:val="0"/>
+          <w:numId w:val="1003"/>
+        </w:numPr>
+      </w:pPr>
+      <w:r>
+        <w:t xml:space="preserve">No leverage column, so position risk is approximated by notional and per-trade stdev.</w:t>
+      </w:r>
+    </w:p>
+    <w:p>
+      <w:pPr>
+        <w:pStyle w:val="Compact"/>
+        <w:numPr>
+          <w:ilvl w:val="0"/>
+          <w:numId w:val="1003"/>
+        </w:numPr>
+      </w:pPr>
+      <w:r>
+        <w:t xml:space="preserve">32 active traders is a small cohort sample. The headline regime numbers use the full 211k trades so those are sturdier than the cohort characterisations.</w:t>
+      </w:r>
+    </w:p>
+    <w:p>
+      <w:pPr>
+        <w:pStyle w:val="Compact"/>
+        <w:numPr>
+          <w:ilvl w:val="0"/>
+          <w:numId w:val="1003"/>
+        </w:numPr>
+      </w:pPr>
+      <w:r>
+        <w:t xml:space="preserve">The Sharpe number uses sqrt(365) annualisation, standard for 24/7 crypto markets but inflated vs the 252-day equity convention.</w:t>
+      </w:r>
+    </w:p>
+    <w:p>
+      <w:pPr>
+        <w:pStyle w:val="Compact"/>
+        <w:numPr>
+          <w:ilvl w:val="0"/>
+          <w:numId w:val="1003"/>
+        </w:numPr>
+      </w:pPr>
+      <w:r>
+        <w:t xml:space="preserve">The win-prob model uses a time-based split (first 80% train, last 20% test). Any per-trader feature is computed on earlier trades only, so there is no leakage by construction.</w:t>
+      </w:r>
+    </w:p>
+    <w:p>
+      <w:pPr>
+        <w:pStyle w:val="Compact"/>
+        <w:numPr>
+          <w:ilvl w:val="0"/>
+          <w:numId w:val="1003"/>
+        </w:numPr>
+      </w:pPr>
+      <w:r>
+        <w:t xml:space="preserve">XGBoost uses n_jobs=1 for bit-exact reproducibility across machines.</w:t>
+      </w:r>
+    </w:p>
+    <w:bookmarkEnd w:id="35"/>
+    <w:bookmarkStart w:id="36" w:name="strategy-ideas-worth-a-follow-up"/>
+    <w:p>
+      <w:pPr>
+        <w:pStyle w:val="Heading2"/>
+      </w:pPr>
+      <w:r>
+        <w:t xml:space="preserve">9. Strategy ideas worth a follow-up</w:t>
+      </w:r>
+    </w:p>
+    <w:p>
+      <w:pPr>
+        <w:pStyle w:val="Compact"/>
+        <w:numPr>
+          <w:ilvl w:val="0"/>
+          <w:numId w:val="1004"/>
+        </w:numPr>
+      </w:pPr>
+      <w:r>
         <w:rPr>
           <w:b/>
           <w:bCs/>
@@ -3810,7 +3946,7 @@
         <w:pStyle w:val="Compact"/>
         <w:numPr>
           <w:ilvl w:val="0"/>
-          <w:numId w:val="1003"/>
+          <w:numId w:val="1004"/>
         </w:numPr>
       </w:pPr>
       <w:r>
@@ -3832,7 +3968,7 @@
         <w:pStyle w:val="Compact"/>
         <w:numPr>
           <w:ilvl w:val="0"/>
-          <w:numId w:val="1003"/>
+          <w:numId w:val="1004"/>
         </w:numPr>
       </w:pPr>
       <w:r>
@@ -3854,7 +3990,7 @@
         <w:pStyle w:val="Compact"/>
         <w:numPr>
           <w:ilvl w:val="0"/>
-          <w:numId w:val="1003"/>
+          <w:numId w:val="1004"/>
         </w:numPr>
       </w:pPr>
       <w:r>
@@ -3871,8 +4007,8 @@
         <w:t xml:space="preserve">Two accounts that go short into Greed regimes and hit on conviction trades. Small allocation, asymmetric payoff.</w:t>
       </w:r>
     </w:p>
-    <w:bookmarkEnd w:id="35"/>
-    <w:bookmarkStart w:id="36" w:name="files-in-this-submission"/>
+    <w:bookmarkEnd w:id="36"/>
+    <w:bookmarkStart w:id="37" w:name="files-in-this-submission"/>
     <w:p>
       <w:pPr>
         <w:pStyle w:val="Heading2"/>
@@ -3886,7 +4022,7 @@
         <w:pStyle w:val="Compact"/>
         <w:numPr>
           <w:ilvl w:val="0"/>
-          <w:numId w:val="1004"/>
+          <w:numId w:val="1005"/>
         </w:numPr>
       </w:pPr>
       <w:r>
@@ -3896,10 +4032,7 @@
         <w:t xml:space="preserve">notebooks/01_eda.ipynb</w:t>
       </w:r>
       <w:r>
-        <w:t xml:space="preserve"> </w:t>
-      </w:r>
-      <w:r>
-        <w:t xml:space="preserve">— cleaned EDA from v1.</w:t>
+        <w:t xml:space="preserve">, cleaned EDA from v1.</w:t>
       </w:r>
     </w:p>
     <w:p>
@@ -3907,7 +4040,7 @@
         <w:pStyle w:val="Compact"/>
         <w:numPr>
           <w:ilvl w:val="0"/>
-          <w:numId w:val="1004"/>
+          <w:numId w:val="1005"/>
         </w:numPr>
       </w:pPr>
       <w:r>
@@ -3917,10 +4050,7 @@
         <w:t xml:space="preserve">notebooks/02_modeling.ipynb</w:t>
       </w:r>
       <w:r>
-        <w:t xml:space="preserve"> </w:t>
-      </w:r>
-      <w:r>
-        <w:t xml:space="preserve">— cohort clustering + win-prob model fit + diagnostics.</w:t>
+        <w:t xml:space="preserve">, cohort clustering + win-prob model fit + diagnostics.</w:t>
       </w:r>
     </w:p>
     <w:p>
@@ -3928,7 +4058,7 @@
         <w:pStyle w:val="Compact"/>
         <w:numPr>
           <w:ilvl w:val="0"/>
-          <w:numId w:val="1004"/>
+          <w:numId w:val="1005"/>
         </w:numPr>
       </w:pPr>
       <w:r>
@@ -3938,10 +4068,7 @@
         <w:t xml:space="preserve">notebooks/03_backtest.ipynb</w:t>
       </w:r>
       <w:r>
-        <w:t xml:space="preserve"> </w:t>
-      </w:r>
-      <w:r>
-        <w:t xml:space="preserve">— walk-forward backtest + sensitivity sweep.</w:t>
+        <w:t xml:space="preserve">, walk-forward backtest + sensitivity sweep.</w:t>
       </w:r>
     </w:p>
     <w:p>
@@ -3949,7 +4076,7 @@
         <w:pStyle w:val="Compact"/>
         <w:numPr>
           <w:ilvl w:val="0"/>
-          <w:numId w:val="1004"/>
+          <w:numId w:val="1005"/>
         </w:numPr>
       </w:pPr>
       <w:r>
@@ -3959,10 +4086,7 @@
         <w:t xml:space="preserve">app/streamlit_app.py</w:t>
       </w:r>
       <w:r>
-        <w:t xml:space="preserve"> </w:t>
-      </w:r>
-      <w:r>
-        <w:t xml:space="preserve">— 3-page interactive dashboard.</w:t>
+        <w:t xml:space="preserve">, 3-page interactive dashboard.</w:t>
       </w:r>
     </w:p>
     <w:p>
@@ -3970,7 +4094,7 @@
         <w:pStyle w:val="Compact"/>
         <w:numPr>
           <w:ilvl w:val="0"/>
-          <w:numId w:val="1004"/>
+          <w:numId w:val="1005"/>
         </w:numPr>
       </w:pPr>
       <w:r>
@@ -3980,10 +4104,7 @@
         <w:t xml:space="preserve">src/{data_loader, features, metrics, models, backtest}.py</w:t>
       </w:r>
       <w:r>
-        <w:t xml:space="preserve"> </w:t>
-      </w:r>
-      <w:r>
-        <w:t xml:space="preserve">— modular code, importable.</w:t>
+        <w:t xml:space="preserve">, modular code, importable.</w:t>
       </w:r>
     </w:p>
     <w:p>
@@ -3991,7 +4112,7 @@
         <w:pStyle w:val="Compact"/>
         <w:numPr>
           <w:ilvl w:val="0"/>
-          <w:numId w:val="1004"/>
+          <w:numId w:val="1005"/>
         </w:numPr>
       </w:pPr>
       <w:r>
@@ -4001,10 +4122,7 @@
         <w:t xml:space="preserve">models/{cohort_kmeans, winprob_xgb}.pkl</w:t>
       </w:r>
       <w:r>
-        <w:t xml:space="preserve"> </w:t>
-      </w:r>
-      <w:r>
-        <w:t xml:space="preserve">— persisted model artefacts.</w:t>
+        <w:t xml:space="preserve">, persisted model artefacts.</w:t>
       </w:r>
     </w:p>
     <w:p>
@@ -4012,7 +4130,7 @@
         <w:pStyle w:val="Compact"/>
         <w:numPr>
           <w:ilvl w:val="0"/>
-          <w:numId w:val="1004"/>
+          <w:numId w:val="1005"/>
         </w:numPr>
       </w:pPr>
       <w:r>
@@ -4022,10 +4140,7 @@
         <w:t xml:space="preserve">outputs/figures/*.png</w:t>
       </w:r>
       <w:r>
-        <w:t xml:space="preserve"> </w:t>
-      </w:r>
-      <w:r>
-        <w:t xml:space="preserve">— saved diagnostic plots.</w:t>
+        <w:t xml:space="preserve">, saved diagnostic plots.</w:t>
       </w:r>
     </w:p>
     <w:p>
@@ -4033,7 +4148,7 @@
         <w:pStyle w:val="Compact"/>
         <w:numPr>
           <w:ilvl w:val="0"/>
-          <w:numId w:val="1004"/>
+          <w:numId w:val="1005"/>
         </w:numPr>
       </w:pPr>
       <w:r>
@@ -4043,10 +4158,7 @@
         <w:t xml:space="preserve">outputs/tables/*.csv</w:t>
       </w:r>
       <w:r>
-        <w:t xml:space="preserve"> </w:t>
-      </w:r>
-      <w:r>
-        <w:t xml:space="preserve">— metric tables (regime, cohort description, model eval, backtest summary, sensitivity).</w:t>
+        <w:t xml:space="preserve">, metric tables (regime, cohort description, model eval, backtest summary, sensitivity).</w:t>
       </w:r>
     </w:p>
     <w:p>
@@ -4054,7 +4166,7 @@
         <w:pStyle w:val="Compact"/>
         <w:numPr>
           <w:ilvl w:val="0"/>
-          <w:numId w:val="1004"/>
+          <w:numId w:val="1005"/>
         </w:numPr>
       </w:pPr>
       <w:r>
@@ -4064,10 +4176,7 @@
         <w:t xml:space="preserve">tests/</w:t>
       </w:r>
       <w:r>
-        <w:t xml:space="preserve"> </w:t>
-      </w:r>
-      <w:r>
-        <w:t xml:space="preserve">— pytest suite covering metrics, models, and backtest (16 tests).</w:t>
+        <w:t xml:space="preserve">, pytest suite covering metrics, models, and backtest (16 tests).</w:t>
       </w:r>
     </w:p>
     <w:p>
@@ -4075,7 +4184,7 @@
         <w:pStyle w:val="Compact"/>
         <w:numPr>
           <w:ilvl w:val="0"/>
-          <w:numId w:val="1004"/>
+          <w:numId w:val="1005"/>
         </w:numPr>
       </w:pPr>
       <w:r>
@@ -4085,14 +4194,11 @@
         <w:t xml:space="preserve">submission_v1/</w:t>
       </w:r>
       <w:r>
-        <w:t xml:space="preserve"> </w:t>
-      </w:r>
-      <w:r>
-        <w:t xml:space="preserve">— the original v1 artefacts preserved as backup.</w:t>
-      </w:r>
-    </w:p>
-    <w:bookmarkEnd w:id="36"/>
+        <w:t xml:space="preserve">, the original v1 artefacts preserved as backup.</w:t>
+      </w:r>
+    </w:p>
     <w:bookmarkEnd w:id="37"/>
+    <w:bookmarkEnd w:id="38"/>
     <w:sectPr>
       <w:footnotePr>
         <w:numRestart w:val="eachSect"/>
@@ -4203,6 +4309,109 @@
       </w:pPr>
     </w:lvl>
   </w:abstractNum>
+  <w:abstractNum w:abstractNumId="991">
+    <w:nsid w:val="0000A991"/>
+    <w:multiLevelType w:val="multilevel"/>
+    <w:lvl w:ilvl="0">
+      <w:numFmt w:val="bullet"/>
+      <w:lvlText w:val=""/>
+      <w:lvlJc w:val="left"/>
+      <w:pPr>
+        <w:ind w:left="720" w:hanging="360"/>
+      </w:pPr>
+      <w:rPr>
+        <w:rFonts w:ascii="Symbol" w:hAnsi="Symbol" w:cs="Symbol" w:hint="default"/>
+      </w:rPr>
+    </w:lvl>
+    <w:lvl w:ilvl="1">
+      <w:numFmt w:val="bullet"/>
+      <w:lvlText w:val="o"/>
+      <w:lvlJc w:val="left"/>
+      <w:pPr>
+        <w:ind w:left="1440" w:hanging="360"/>
+      </w:pPr>
+      <w:rPr>
+        <w:rFonts w:ascii="Courier New" w:hAnsi="Courier New" w:cs="Courier New" w:hint="default"/>
+      </w:rPr>
+    </w:lvl>
+    <w:lvl w:ilvl="2">
+      <w:numFmt w:val="bullet"/>
+      <w:lvlText w:val=""/>
+      <w:lvlJc w:val="left"/>
+      <w:pPr>
+        <w:ind w:left="2160" w:hanging="360"/>
+      </w:pPr>
+      <w:rPr>
+        <w:rFonts w:ascii="Wingdings" w:hAnsi="Wingdings" w:cs="Wingdings" w:hint="default"/>
+      </w:rPr>
+    </w:lvl>
+    <w:lvl w:ilvl="3">
+      <w:numFmt w:val="bullet"/>
+      <w:lvlText w:val=""/>
+      <w:lvlJc w:val="left"/>
+      <w:pPr>
+        <w:ind w:left="2880" w:hanging="360"/>
+      </w:pPr>
+      <w:rPr>
+        <w:rFonts w:ascii="Symbol" w:hAnsi="Symbol" w:cs="Symbol" w:hint="default"/>
+      </w:rPr>
+    </w:lvl>
+    <w:lvl w:ilvl="4">
+      <w:numFmt w:val="bullet"/>
+      <w:lvlText w:val="o"/>
+      <w:lvlJc w:val="left"/>
+      <w:pPr>
+        <w:ind w:left="3600" w:hanging="360"/>
+      </w:pPr>
+      <w:rPr>
+        <w:rFonts w:ascii="Courier New" w:hAnsi="Courier New" w:cs="Courier New" w:hint="default"/>
+      </w:rPr>
+    </w:lvl>
+    <w:lvl w:ilvl="5">
+      <w:numFmt w:val="bullet"/>
+      <w:lvlText w:val=""/>
+      <w:lvlJc w:val="left"/>
+      <w:pPr>
+        <w:ind w:left="4320" w:hanging="360"/>
+      </w:pPr>
+      <w:rPr>
+        <w:rFonts w:ascii="Wingdings" w:hAnsi="Wingdings" w:cs="Wingdings" w:hint="default"/>
+      </w:rPr>
+    </w:lvl>
+    <w:lvl w:ilvl="6">
+      <w:numFmt w:val="bullet"/>
+      <w:lvlText w:val=""/>
+      <w:lvlJc w:val="left"/>
+      <w:pPr>
+        <w:ind w:left="5040" w:hanging="360"/>
+      </w:pPr>
+      <w:rPr>
+        <w:rFonts w:ascii="Symbol" w:hAnsi="Symbol" w:cs="Symbol" w:hint="default"/>
+      </w:rPr>
+    </w:lvl>
+    <w:lvl w:ilvl="7">
+      <w:numFmt w:val="bullet"/>
+      <w:lvlText w:val="o"/>
+      <w:lvlJc w:val="left"/>
+      <w:pPr>
+        <w:ind w:left="5760" w:hanging="360"/>
+      </w:pPr>
+      <w:rPr>
+        <w:rFonts w:ascii="Courier New" w:hAnsi="Courier New" w:cs="Courier New" w:hint="default"/>
+      </w:rPr>
+    </w:lvl>
+    <w:lvl w:ilvl="8">
+      <w:numFmt w:val="bullet"/>
+      <w:lvlText w:val=""/>
+      <w:lvlJc w:val="left"/>
+      <w:pPr>
+        <w:ind w:left="6480" w:hanging="360"/>
+      </w:pPr>
+      <w:rPr>
+        <w:rFonts w:ascii="Wingdings" w:hAnsi="Wingdings" w:cs="Wingdings" w:hint="default"/>
+      </w:rPr>
+    </w:lvl>
+  </w:abstractNum>
   <w:abstractNum w:abstractNumId="99411">
     <w:nsid w:val="00A99411"/>
     <w:multiLevelType w:val="multilevel"/>
@@ -4288,113 +4497,13 @@
       </w:pPr>
     </w:lvl>
   </w:abstractNum>
-  <w:abstractNum w:abstractNumId="991">
-    <w:nsid w:val="0000A991"/>
-    <w:multiLevelType w:val="multilevel"/>
-    <w:lvl w:ilvl="0">
-      <w:numFmt w:val="bullet"/>
-      <w:lvlText w:val=""/>
-      <w:lvlJc w:val="left"/>
-      <w:pPr>
-        <w:ind w:left="720" w:hanging="360"/>
-      </w:pPr>
-      <w:rPr>
-        <w:rFonts w:ascii="Symbol" w:hAnsi="Symbol" w:cs="Symbol" w:hint="default"/>
-      </w:rPr>
-    </w:lvl>
-    <w:lvl w:ilvl="1">
-      <w:numFmt w:val="bullet"/>
-      <w:lvlText w:val="o"/>
-      <w:lvlJc w:val="left"/>
-      <w:pPr>
-        <w:ind w:left="1440" w:hanging="360"/>
-      </w:pPr>
-      <w:rPr>
-        <w:rFonts w:ascii="Courier New" w:hAnsi="Courier New" w:cs="Courier New" w:hint="default"/>
-      </w:rPr>
-    </w:lvl>
-    <w:lvl w:ilvl="2">
-      <w:numFmt w:val="bullet"/>
-      <w:lvlText w:val=""/>
-      <w:lvlJc w:val="left"/>
-      <w:pPr>
-        <w:ind w:left="2160" w:hanging="360"/>
-      </w:pPr>
-      <w:rPr>
-        <w:rFonts w:ascii="Wingdings" w:hAnsi="Wingdings" w:cs="Wingdings" w:hint="default"/>
-      </w:rPr>
-    </w:lvl>
-    <w:lvl w:ilvl="3">
-      <w:numFmt w:val="bullet"/>
-      <w:lvlText w:val=""/>
-      <w:lvlJc w:val="left"/>
-      <w:pPr>
-        <w:ind w:left="2880" w:hanging="360"/>
-      </w:pPr>
-      <w:rPr>
-        <w:rFonts w:ascii="Symbol" w:hAnsi="Symbol" w:cs="Symbol" w:hint="default"/>
-      </w:rPr>
-    </w:lvl>
-    <w:lvl w:ilvl="4">
-      <w:numFmt w:val="bullet"/>
-      <w:lvlText w:val="o"/>
-      <w:lvlJc w:val="left"/>
-      <w:pPr>
-        <w:ind w:left="3600" w:hanging="360"/>
-      </w:pPr>
-      <w:rPr>
-        <w:rFonts w:ascii="Courier New" w:hAnsi="Courier New" w:cs="Courier New" w:hint="default"/>
-      </w:rPr>
-    </w:lvl>
-    <w:lvl w:ilvl="5">
-      <w:numFmt w:val="bullet"/>
-      <w:lvlText w:val=""/>
-      <w:lvlJc w:val="left"/>
-      <w:pPr>
-        <w:ind w:left="4320" w:hanging="360"/>
-      </w:pPr>
-      <w:rPr>
-        <w:rFonts w:ascii="Wingdings" w:hAnsi="Wingdings" w:cs="Wingdings" w:hint="default"/>
-      </w:rPr>
-    </w:lvl>
-    <w:lvl w:ilvl="6">
-      <w:numFmt w:val="bullet"/>
-      <w:lvlText w:val=""/>
-      <w:lvlJc w:val="left"/>
-      <w:pPr>
-        <w:ind w:left="5040" w:hanging="360"/>
-      </w:pPr>
-      <w:rPr>
-        <w:rFonts w:ascii="Symbol" w:hAnsi="Symbol" w:cs="Symbol" w:hint="default"/>
-      </w:rPr>
-    </w:lvl>
-    <w:lvl w:ilvl="7">
-      <w:numFmt w:val="bullet"/>
-      <w:lvlText w:val="o"/>
-      <w:lvlJc w:val="left"/>
-      <w:pPr>
-        <w:ind w:left="5760" w:hanging="360"/>
-      </w:pPr>
-      <w:rPr>
-        <w:rFonts w:ascii="Courier New" w:hAnsi="Courier New" w:cs="Courier New" w:hint="default"/>
-      </w:rPr>
-    </w:lvl>
-    <w:lvl w:ilvl="8">
-      <w:numFmt w:val="bullet"/>
-      <w:lvlText w:val=""/>
-      <w:lvlJc w:val="left"/>
-      <w:pPr>
-        <w:ind w:left="6480" w:hanging="360"/>
-      </w:pPr>
-      <w:rPr>
-        <w:rFonts w:ascii="Wingdings" w:hAnsi="Wingdings" w:cs="Wingdings" w:hint="default"/>
-      </w:rPr>
-    </w:lvl>
-  </w:abstractNum>
   <w:num w:numId="1000">
     <w:abstractNumId w:val="990"/>
   </w:num>
   <w:num w:numId="1001">
+    <w:abstractNumId w:val="991"/>
+  </w:num>
+  <w:num w:numId="1002">
     <w:abstractNumId w:val="99411"/>
     <w:lvlOverride w:ilvl="0">
       <w:startOverride w:val="1"/>
@@ -4424,10 +4533,10 @@
       <w:startOverride w:val="1"/>
     </w:lvlOverride>
   </w:num>
-  <w:num w:numId="1002">
+  <w:num w:numId="1003">
     <w:abstractNumId w:val="991"/>
   </w:num>
-  <w:num w:numId="1003">
+  <w:num w:numId="1004">
     <w:abstractNumId w:val="99411"/>
     <w:lvlOverride w:ilvl="0">
       <w:startOverride w:val="1"/>
@@ -4457,7 +4566,7 @@
       <w:startOverride w:val="1"/>
     </w:lvlOverride>
   </w:num>
-  <w:num w:numId="1004">
+  <w:num w:numId="1005">
     <w:abstractNumId w:val="991"/>
   </w:num>
 </w:numbering>

</xml_diff>

<commit_message>
ds: reconcile report numbers with post-determinism CSV outputs
After the n_jobs=1 reproducibility fix shifted XGBoost output, the model
and backtest numbers in report.md, report_full.md, and the README
headline no longer matched the regenerated outputs/tables/*.csv files.
Updated all three documents to the new values: overall AUC 0.5786 vs
0.6129, per-regime AUCs revised (Extreme Fear 0.8122, Fear 0.4575,
Greed 0.5432, Neutral 0.5624), backtest Sharpe 15.72 vs 14.64, uplift
13.4 vs 13.5, taken_trades 11,444 vs 11,408. PDF and DOCX in
submission_v2/ re-rendered from the updated markdown. The qualitative
story is unchanged: Extreme Fear is the only regime with model signal,
the regime exclusion rule still drives the backtest win, and the
strategy still avoids the $419k drawdown. build_notebooks.py:295 also
gained the kind='mergesort' marker that was missed in the prior pass
so all sort_values('ts') calls in the codebase are tie-stable.
</commit_message>
<xml_diff>
--- a/DS/submission_v2/report.docx
+++ b/DS/submission_v2/report.docx
@@ -107,7 +107,7 @@
         <w:t xml:space="preserve"> </w:t>
       </w:r>
       <w:r>
-        <w:t xml:space="preserve">clears AUC 0.81 in Extreme Fear, AUC 0.49 in plain Fear; the model is most useful as an extreme-zone filter.</w:t>
+        <w:t xml:space="preserve">clears AUC 0.81 in Extreme Fear, AUC 0.46 in plain Fear; the model is most useful as an extreme-zone filter.</w:t>
       </w:r>
     </w:p>
     <w:p>
@@ -129,7 +129,7 @@
         <w:t xml:space="preserve"> </w:t>
       </w:r>
       <w:r>
-        <w:t xml:space="preserve">(regime filter + win-prob filter) ships +13.5 % more PnL on half the trades, Sharpe 14.6 vs 6.6 baseline, zero drawdown.</w:t>
+        <w:t xml:space="preserve">(regime filter + win-prob filter) ships +13.4 % more PnL on half the trades, Sharpe 15.7 vs 6.6 baseline, zero drawdown.</w:t>
       </w:r>
     </w:p>
     <w:p>
@@ -2575,7 +2575,7 @@
           <w:b/>
           <w:bCs/>
         </w:rPr>
-        <w:t xml:space="preserve">0.6129</w:t>
+        <w:t xml:space="preserve">0.5786</w:t>
       </w:r>
       <w:r>
         <w:t xml:space="preserve">. The interesting story is the per-regime breakdown:</w:t>
@@ -2660,7 +2660,7 @@
               <w:pStyle w:val="Compact"/>
             </w:pPr>
             <w:r>
-              <w:t xml:space="preserve">0.6129</w:t>
+              <w:t xml:space="preserve">0.5786</w:t>
             </w:r>
           </w:p>
         </w:tc>
@@ -2695,7 +2695,7 @@
               <w:pStyle w:val="Compact"/>
             </w:pPr>
             <w:r>
-              <w:t xml:space="preserve">0.8075</w:t>
+              <w:t xml:space="preserve">0.8122</w:t>
             </w:r>
           </w:p>
         </w:tc>
@@ -2730,7 +2730,7 @@
               <w:pStyle w:val="Compact"/>
             </w:pPr>
             <w:r>
-              <w:t xml:space="preserve">0.4874</w:t>
+              <w:t xml:space="preserve">0.4575</w:t>
             </w:r>
           </w:p>
         </w:tc>
@@ -2765,7 +2765,7 @@
               <w:pStyle w:val="Compact"/>
             </w:pPr>
             <w:r>
-              <w:t xml:space="preserve">0.6175</w:t>
+              <w:t xml:space="preserve">0.5432</w:t>
             </w:r>
           </w:p>
         </w:tc>
@@ -2800,7 +2800,7 @@
               <w:pStyle w:val="Compact"/>
             </w:pPr>
             <w:r>
-              <w:t xml:space="preserve">0.5818</w:t>
+              <w:t xml:space="preserve">0.5624</w:t>
             </w:r>
           </w:p>
         </w:tc>
@@ -2811,7 +2811,7 @@
         <w:pStyle w:val="BodyText"/>
       </w:pPr>
       <w:r>
-        <w:t xml:space="preserve">The model has clear predictive power on Extreme Fear days (AUC 0.81) and useful signal on Greed days (0.62). On plain Fear days the AUC sits at chance (0.49); those trades look essentially random given the features. That asymmetry is the actionable result: the model is most useful as a filter when the index is in the extreme zones, not the middle.</w:t>
+        <w:t xml:space="preserve">The model has clear predictive power on Extreme Fear days (AUC 0.81). Every other regime sits near chance (AUC 0.46 to 0.56), so the model is essentially worthless outside the extreme zones. That asymmetry is the actionable result: treat the model as an Extreme-Fear-only filter, not a general edge.</w:t>
       </w:r>
     </w:p>
     <w:p>
@@ -3119,7 +3119,7 @@
               <w:pStyle w:val="Compact"/>
             </w:pPr>
             <w:r>
-              <w:t xml:space="preserve">11,408</w:t>
+              <w:t xml:space="preserve">11,444</w:t>
             </w:r>
           </w:p>
         </w:tc>
@@ -3154,7 +3154,7 @@
               <w:pStyle w:val="Compact"/>
             </w:pPr>
             <w:r>
-              <w:t xml:space="preserve">$1,198,945</w:t>
+              <w:t xml:space="preserve">$1,197,572</w:t>
             </w:r>
           </w:p>
         </w:tc>
@@ -3189,7 +3189,7 @@
               <w:pStyle w:val="Compact"/>
             </w:pPr>
             <w:r>
-              <w:t xml:space="preserve">14.64</w:t>
+              <w:t xml:space="preserve">15.72</w:t>
             </w:r>
           </w:p>
         </w:tc>
@@ -3256,7 +3256,7 @@
           <w:b/>
           <w:bCs/>
         </w:rPr>
-        <w:t xml:space="preserve">+13.5 percent more PnL on half the trades</w:t>
+        <w:t xml:space="preserve">+13.4 percent more PnL on half the trades</w:t>
       </w:r>
       <w:r>
         <w:t xml:space="preserve">,</w:t>
@@ -3269,7 +3269,7 @@
           <w:b/>
           <w:bCs/>
         </w:rPr>
-        <w:t xml:space="preserve">doubles the Sharpe</w:t>
+        <w:t xml:space="preserve">more than doubles the Sharpe (15.72 vs 6.62)</w:t>
       </w:r>
       <w:r>
         <w:t xml:space="preserve">, and</w:t>
@@ -3398,29 +3398,29 @@
               <w:pStyle w:val="Compact"/>
             </w:pPr>
             <w:r>
-              <w:t xml:space="preserve">+1.07 %</w:t>
-            </w:r>
-          </w:p>
-        </w:tc>
-        <w:tc>
-          <w:tcPr/>
-          <w:p>
-            <w:pPr>
-              <w:pStyle w:val="Compact"/>
-            </w:pPr>
-            <w:r>
-              <w:t xml:space="preserve">6.70</w:t>
-            </w:r>
-          </w:p>
-        </w:tc>
-        <w:tc>
-          <w:tcPr/>
-          <w:p>
-            <w:pPr>
-              <w:pStyle w:val="Compact"/>
-            </w:pPr>
-            <w:r>
-              <w:t xml:space="preserve">$-416,701</w:t>
+              <w:t xml:space="preserve">-1.53 %</w:t>
+            </w:r>
+          </w:p>
+        </w:tc>
+        <w:tc>
+          <w:tcPr/>
+          <w:p>
+            <w:pPr>
+              <w:pStyle w:val="Compact"/>
+            </w:pPr>
+            <w:r>
+              <w:t xml:space="preserve">6.51</w:t>
+            </w:r>
+          </w:p>
+        </w:tc>
+        <w:tc>
+          <w:tcPr/>
+          <w:p>
+            <w:pPr>
+              <w:pStyle w:val="Compact"/>
+            </w:pPr>
+            <w:r>
+              <w:t xml:space="preserve">$-419,161</w:t>
             </w:r>
           </w:p>
         </w:tc>
@@ -3444,29 +3444,29 @@
               <w:pStyle w:val="Compact"/>
             </w:pPr>
             <w:r>
-              <w:t xml:space="preserve">-3.27 %</w:t>
-            </w:r>
-          </w:p>
-        </w:tc>
-        <w:tc>
-          <w:tcPr/>
-          <w:p>
-            <w:pPr>
-              <w:pStyle w:val="Compact"/>
-            </w:pPr>
-            <w:r>
-              <w:t xml:space="preserve">6.41</w:t>
-            </w:r>
-          </w:p>
-        </w:tc>
-        <w:tc>
-          <w:tcPr/>
-          <w:p>
-            <w:pPr>
-              <w:pStyle w:val="Compact"/>
-            </w:pPr>
-            <w:r>
-              <w:t xml:space="preserve">$-418,477</w:t>
+              <w:t xml:space="preserve">-5.95 %</w:t>
+            </w:r>
+          </w:p>
+        </w:tc>
+        <w:tc>
+          <w:tcPr/>
+          <w:p>
+            <w:pPr>
+              <w:pStyle w:val="Compact"/>
+            </w:pPr>
+            <w:r>
+              <w:t xml:space="preserve">6.39</w:t>
+            </w:r>
+          </w:p>
+        </w:tc>
+        <w:tc>
+          <w:tcPr/>
+          <w:p>
+            <w:pPr>
+              <w:pStyle w:val="Compact"/>
+            </w:pPr>
+            <w:r>
+              <w:t xml:space="preserve">$-420,431</w:t>
             </w:r>
           </w:p>
         </w:tc>
@@ -3490,29 +3490,29 @@
               <w:pStyle w:val="Compact"/>
             </w:pPr>
             <w:r>
-              <w:t xml:space="preserve">-5.96 %</w:t>
-            </w:r>
-          </w:p>
-        </w:tc>
-        <w:tc>
-          <w:tcPr/>
-          <w:p>
-            <w:pPr>
-              <w:pStyle w:val="Compact"/>
-            </w:pPr>
-            <w:r>
-              <w:t xml:space="preserve">6.26</w:t>
-            </w:r>
-          </w:p>
-        </w:tc>
-        <w:tc>
-          <w:tcPr/>
-          <w:p>
-            <w:pPr>
-              <w:pStyle w:val="Compact"/>
-            </w:pPr>
-            <w:r>
-              <w:t xml:space="preserve">$-415,276</w:t>
+              <w:t xml:space="preserve">-9.01 %</w:t>
+            </w:r>
+          </w:p>
+        </w:tc>
+        <w:tc>
+          <w:tcPr/>
+          <w:p>
+            <w:pPr>
+              <w:pStyle w:val="Compact"/>
+            </w:pPr>
+            <w:r>
+              <w:t xml:space="preserve">6.21</w:t>
+            </w:r>
+          </w:p>
+        </w:tc>
+        <w:tc>
+          <w:tcPr/>
+          <w:p>
+            <w:pPr>
+              <w:pStyle w:val="Compact"/>
+            </w:pPr>
+            <w:r>
+              <w:t xml:space="preserve">$-418,227</w:t>
             </w:r>
           </w:p>
         </w:tc>
@@ -3536,29 +3536,29 @@
               <w:pStyle w:val="Compact"/>
             </w:pPr>
             <w:r>
-              <w:t xml:space="preserve">-10.99 %</w:t>
-            </w:r>
-          </w:p>
-        </w:tc>
-        <w:tc>
-          <w:tcPr/>
-          <w:p>
-            <w:pPr>
-              <w:pStyle w:val="Compact"/>
-            </w:pPr>
-            <w:r>
-              <w:t xml:space="preserve">5.90</w:t>
-            </w:r>
-          </w:p>
-        </w:tc>
-        <w:tc>
-          <w:tcPr/>
-          <w:p>
-            <w:pPr>
-              <w:pStyle w:val="Compact"/>
-            </w:pPr>
-            <w:r>
-              <w:t xml:space="preserve">$-418,468</w:t>
+              <w:t xml:space="preserve">-12.81 %</w:t>
+            </w:r>
+          </w:p>
+        </w:tc>
+        <w:tc>
+          <w:tcPr/>
+          <w:p>
+            <w:pPr>
+              <w:pStyle w:val="Compact"/>
+            </w:pPr>
+            <w:r>
+              <w:t xml:space="preserve">6.02</w:t>
+            </w:r>
+          </w:p>
+        </w:tc>
+        <w:tc>
+          <w:tcPr/>
+          <w:p>
+            <w:pPr>
+              <w:pStyle w:val="Compact"/>
+            </w:pPr>
+            <w:r>
+              <w:t xml:space="preserve">$-420,884</w:t>
             </w:r>
           </w:p>
         </w:tc>
@@ -3582,29 +3582,29 @@
               <w:pStyle w:val="Compact"/>
             </w:pPr>
             <w:r>
-              <w:t xml:space="preserve">-13.85 %</w:t>
-            </w:r>
-          </w:p>
-        </w:tc>
-        <w:tc>
-          <w:tcPr/>
-          <w:p>
-            <w:pPr>
-              <w:pStyle w:val="Compact"/>
-            </w:pPr>
-            <w:r>
-              <w:t xml:space="preserve">5.69</w:t>
-            </w:r>
-          </w:p>
-        </w:tc>
-        <w:tc>
-          <w:tcPr/>
-          <w:p>
-            <w:pPr>
-              <w:pStyle w:val="Compact"/>
-            </w:pPr>
-            <w:r>
-              <w:t xml:space="preserve">$-431,533</w:t>
+              <w:t xml:space="preserve">-14.31 %</w:t>
+            </w:r>
+          </w:p>
+        </w:tc>
+        <w:tc>
+          <w:tcPr/>
+          <w:p>
+            <w:pPr>
+              <w:pStyle w:val="Compact"/>
+            </w:pPr>
+            <w:r>
+              <w:t xml:space="preserve">6.08</w:t>
+            </w:r>
+          </w:p>
+        </w:tc>
+        <w:tc>
+          <w:tcPr/>
+          <w:p>
+            <w:pPr>
+              <w:pStyle w:val="Compact"/>
+            </w:pPr>
+            <w:r>
+              <w:t xml:space="preserve">$-399,075</w:t>
             </w:r>
           </w:p>
         </w:tc>
@@ -3960,7 +3960,7 @@
         <w:t xml:space="preserve"> </w:t>
       </w:r>
       <w:r>
-        <w:t xml:space="preserve">AUC 0.81 in that regime is real signal. AUC 0.49 in Fear means do not bother filtering there.</w:t>
+        <w:t xml:space="preserve">AUC 0.81 in that regime is real signal. AUC 0.46 in plain Fear and 0.54 in Greed mean the model is not worth running outside the extreme zones.</w:t>
       </w:r>
     </w:p>
     <w:p>

</xml_diff>